<commit_message>
Address remaining co-author edits in manuscript and supplement
Adds site relative risks to Table S2, uses Linda Ernst's "MVM lesion"
wording, and splits two long sentences.

Co-Authored-By: Claude Opus 5.5 <noreply@anthropic.com>
Claude-Session: https://claude.ai/code/session_017cSSzHhwQMgJphnHdZ9H9w
</commit_message>
<xml_diff>
--- a/cpp-placentas/manuscript/Response_to_coauthors.docx
+++ b/cpp-placentas/manuscript/Response_to_coauthors.docx
@@ -1463,7 +1463,7 @@
                 <w:sz w:val="16"/>
                 <w:szCs w:val="16"/>
               </w:rPr>
-              <w:t xml:space="preserve">Site-adjusted model is now primary, with the no-site model as secondary. Sequential adjustment, Boston stratification, site as a random effect, and adjustment for pathologist are in the supplement.</w:t>
+              <w:t xml:space="preserve">Site-adjusted model is now primary, with the no-site model as secondary. Sequential adjustment, Boston stratification, site as a random effect, adjustment for pathologist, and the site terms from the primary model are in the supplement.</w:t>
             </w:r>
           </w:p>
         </w:tc>
@@ -1494,7 +1494,7 @@
                 <w:sz w:val="16"/>
                 <w:szCs w:val="16"/>
               </w:rPr>
-              <w:t xml:space="preserve">Methods 2.4 and 2.5, Tables S3, S8, S10, S11</w:t>
+              <w:t xml:space="preserve">Methods 2.4 and 2.5, Tables S2, S3, S8, S10, S11</w:t>
             </w:r>
           </w:p>
         </w:tc>

</xml_diff>

<commit_message>
Remove pathologist, Boston validity, and sibling analyses; tighten Methods
Drops the examiner adjustment, the Boston construct-validity check, and
the within-mother sibling analysis from the manuscript, supplement, and
response table, renumbers the supplement to Tables S1 to S10, and
applies the agreed Methods edits (exposure sentence order, single joint
exposure definition, MVM scoring wording, SGA definition in Covariates).

Co-Authored-By: Claude Opus 5.5 <noreply@anthropic.com>
Claude-Session: https://claude.ai/code/session_017cSSzHhwQMgJphnHdZ9H9w
</commit_message>
<xml_diff>
--- a/cpp-placentas/manuscript/Response_to_coauthors.docx
+++ b/cpp-placentas/manuscript/Response_to_coauthors.docx
@@ -1463,7 +1463,7 @@
                 <w:sz w:val="16"/>
                 <w:szCs w:val="16"/>
               </w:rPr>
-              <w:t xml:space="preserve">Site-adjusted model is now primary, with the no-site model as secondary. Sequential adjustment, Boston stratification, site as a random effect, adjustment for pathologist, and the site terms from the primary model are in the supplement.</w:t>
+              <w:t xml:space="preserve">Site-adjusted model is now primary, with the no-site model as secondary. Sequential adjustment, Boston stratification, site as a random effect, and the site terms from the primary model are in the supplement.</w:t>
             </w:r>
           </w:p>
         </w:tc>
@@ -1494,7 +1494,7 @@
                 <w:sz w:val="16"/>
                 <w:szCs w:val="16"/>
               </w:rPr>
-              <w:t xml:space="preserve">Methods 2.4 and 2.5, Tables S2, S3, S8, S10, S11</w:t>
+              <w:t xml:space="preserve">Methods 2.4 and 2.5, Tables S2, S3, S8, S9</w:t>
             </w:r>
           </w:p>
         </w:tc>
@@ -1623,7 +1623,7 @@
                 <w:sz w:val="16"/>
                 <w:szCs w:val="16"/>
               </w:rPr>
-              <w:t xml:space="preserve">Added a construct validity check comparing expected associations with preterm birth, SGA, pre-eclampsia, and spontaneous labour in Boston and other centres, and the Boston stratified results. Boston recorded more AI and far more foetal-only inflammation.</w:t>
+              <w:t xml:space="preserve">Boston stratified results are reported. Boston recorded more AI and far more foetal-only inflammation, which is discussed as a likely reading convention.</w:t>
             </w:r>
           </w:p>
         </w:tc>
@@ -1654,7 +1654,7 @@
                 <w:sz w:val="16"/>
                 <w:szCs w:val="16"/>
               </w:rPr>
-              <w:t xml:space="preserve">Results 3.4 and 3.5, Discussion 4.2, Tables S8 and S9</w:t>
+              <w:t xml:space="preserve">Results 3.4 and 3.5, Discussion 4.2, Table S8</w:t>
             </w:r>
           </w:p>
         </w:tc>
@@ -3543,7 +3543,7 @@
                 <w:sz w:val="16"/>
                 <w:szCs w:val="16"/>
               </w:rPr>
-              <w:t xml:space="preserve">Explored. Only 78 mothers were discordant for both IH and MVM (73 for AI), and estimates were too imprecise to be informative.</w:t>
+              <w:t xml:space="preserve">Explored but not feasible. Only 78 mothers were discordant for both IH and MVM (73 for AI), and estimates were too imprecise to be informative, so this analysis is not reported.</w:t>
             </w:r>
           </w:p>
         </w:tc>
@@ -3574,7 +3574,7 @@
                 <w:sz w:val="16"/>
                 <w:szCs w:val="16"/>
               </w:rPr>
-              <w:t xml:space="preserve">Results 3.5, Table S13</w:t>
+              <w:t xml:space="preserve">Not reported</w:t>
             </w:r>
           </w:p>
         </w:tc>

</xml_diff>

<commit_message>
Renumber supplementary tables in order of first citation
Co-Authored-By: Claude Opus 5.5 <noreply@anthropic.com>
Claude-Session: https://claude.ai/code/session_017cSSzHhwQMgJphnHdZ9H9w
</commit_message>
<xml_diff>
--- a/cpp-placentas/manuscript/Response_to_coauthors.docx
+++ b/cpp-placentas/manuscript/Response_to_coauthors.docx
@@ -374,7 +374,7 @@
                 <w:sz w:val="16"/>
                 <w:szCs w:val="16"/>
               </w:rPr>
-              <w:t xml:space="preserve">Results 3.2, Table S4</w:t>
+              <w:t xml:space="preserve">Results 3.2, Table S3</w:t>
             </w:r>
           </w:p>
         </w:tc>
@@ -1494,7 +1494,7 @@
                 <w:sz w:val="16"/>
                 <w:szCs w:val="16"/>
               </w:rPr>
-              <w:t xml:space="preserve">Methods 2.4 and 2.5, Tables S2, S3, S8, S9</w:t>
+              <w:t xml:space="preserve">Methods 2.4 and 2.5, Tables S2, S7, S9, S8</w:t>
             </w:r>
           </w:p>
         </w:tc>
@@ -1654,7 +1654,7 @@
                 <w:sz w:val="16"/>
                 <w:szCs w:val="16"/>
               </w:rPr>
-              <w:t xml:space="preserve">Results 3.4, Discussion 4.2, Table S8</w:t>
+              <w:t xml:space="preserve">Results 3.4, Discussion 4.2, Table S9</w:t>
             </w:r>
           </w:p>
         </w:tc>
@@ -2774,7 +2774,7 @@
                 <w:sz w:val="16"/>
                 <w:szCs w:val="16"/>
               </w:rPr>
-              <w:t xml:space="preserve">Results 3.4, Table S6</w:t>
+              <w:t xml:space="preserve">Results 3.4, Table S5</w:t>
             </w:r>
           </w:p>
         </w:tc>
@@ -2903,7 +2903,7 @@
                 <w:sz w:val="16"/>
                 <w:szCs w:val="16"/>
               </w:rPr>
-              <w:t xml:space="preserve">Mutually adjusted estimates are unchanged (Table S4). The joint exposure shows higher risk only when both are present (RR 1.37).</w:t>
+              <w:t xml:space="preserve">Mutually adjusted estimates are unchanged (Table S3). The joint exposure shows higher risk only when both are present (RR 1.37).</w:t>
             </w:r>
           </w:p>
         </w:tc>
@@ -2934,7 +2934,7 @@
                 <w:sz w:val="16"/>
                 <w:szCs w:val="16"/>
               </w:rPr>
-              <w:t xml:space="preserve">Results 3.2 and 3.3, Tables 2 and S4</w:t>
+              <w:t xml:space="preserve">Results 3.2 and 3.3, Tables 2 and S3</w:t>
             </w:r>
           </w:p>
         </w:tc>
@@ -4374,7 +4374,7 @@
                 <w:sz w:val="16"/>
                 <w:szCs w:val="16"/>
               </w:rPr>
-              <w:t xml:space="preserve">Results 3.4, Table S7</w:t>
+              <w:t xml:space="preserve">Results 3.4, Table S6</w:t>
             </w:r>
           </w:p>
         </w:tc>
@@ -4534,7 +4534,7 @@
                 <w:sz w:val="16"/>
                 <w:szCs w:val="16"/>
               </w:rPr>
-              <w:t xml:space="preserve">Results 3.3, Table S5</w:t>
+              <w:t xml:space="preserve">Results 3.3, Table S4</w:t>
             </w:r>
           </w:p>
         </w:tc>

</xml_diff>